<commit_message>
cacb adversary-complaint: the counsel lines start on line 1's baseline (9.6 pt down, typst counsel-drop, docx 192 twips), so every second one shares a line number's baseline; docx XENG-001..003 pass (344/344 lines); check.sh typst 9 passed 0 failed, docx 13 passed 0 failed (fb-595.68.21)
</commit_message>
<xml_diff>
--- a/courts/ninth-circuit/california/federal/bankruptcy-central-district/adversary-complaint/usage/OUTPUT-adversary-complaint.docx
+++ b/courts/ninth-circuit/california/federal/bankruptcy-central-district/adversary-complaint/usage/OUTPUT-adversary-complaint.docx
@@ -4,7 +4,7 @@
   <w:body>
     <w:p>
       <w:pPr>
-        <w:spacing w:before="0" w:after="0" w:line="240" w:lineRule="exact"/>
+        <w:spacing w:before="192" w:after="0" w:line="240" w:lineRule="exact"/>
         <w:ind w:left="0" w:firstLine="0"/>
         <w:jc w:val="left"/>
       </w:pPr>
@@ -326,7 +326,7 @@
       <w:pPr>
         <w:keepNext/>
         <w:keepLines/>
-        <w:spacing w:before="240" w:after="0" w:line="480" w:lineRule="exact"/>
+        <w:spacing w:before="48" w:after="0" w:line="480" w:lineRule="exact"/>
         <w:ind w:left="0" w:firstLine="0"/>
         <w:jc w:val="center"/>
       </w:pPr>

</xml_diff>